<commit_message>
fix(provincial): actualizar los docx de OMA provincial a 2026
Los formularios de Autorización y Compromiso del provincial OMA seguían
con los datos de 2025.

- Autorización: fechas del certamen 17/18/19 → 28/29/30 de septiembre y
  año de las firmas 2025 → 2026
- Compromiso: edición 42ª → 43ª y año de las fechas 2025 → 2026

Co-Authored-By: Claude Opus 5 <noreply@anthropic.com>
Claude-Session: https://claude.ai/code/session_01TunckaPLxberQUPrPs417N
</commit_message>
<xml_diff>
--- a/public/files/provincial/oma/Autorización.docx
+++ b/public/files/provincial/oma/Autorización.docx
@@ -881,7 +881,7 @@
           <w:rtl w:val="0"/>
           <w:lang w:val="es-ES_tradnl"/>
         </w:rPr>
-        <w:t>as 17, 18 y 19 de septiembre del corriente, en la ciudad de Mar del Plata, provincia de Buenos Aires.     _____________________________________________</w:t>
+        <w:t>as 28, 29 y 30 de septiembre del corriente, en la ciudad de Mar del Plata, provincia de Buenos Aires.     _____________________________________________</w:t>
       </w:r>
     </w:p>
     <w:p>
@@ -1358,7 +1358,7 @@
           <w:rtl w:val="0"/>
           <w:lang w:val="es-ES_tradnl"/>
         </w:rPr>
-        <w:t>.....................................................................de 2025.</w:t>
+        <w:t>.....................................................................de 2026.</w:t>
       </w:r>
     </w:p>
     <w:p>
@@ -1554,7 +1554,7 @@
           <w:rtl w:val="0"/>
           <w:lang w:val="es-ES_tradnl"/>
         </w:rPr>
-        <w:t>........................................................................................de 2025.</w:t>
+        <w:t>........................................................................................de 2026.</w:t>
       </w:r>
     </w:p>
     <w:p>

</xml_diff>